<commit_message>
Update student correspondence to first-person concise bulleted format
</commit_message>
<xml_diff>
--- a/revisions/Student_Correspondence_to_Examiner.docx
+++ b/revisions/Student_Correspondence_to_Examiner.docx
@@ -165,26 +165,13 @@
               <w:rPr>
                 <w:sz w:val="19"/>
               </w:rPr>
-              <w:t>The student expresses sincere gratitude to the worthy examiner for this constructive feedback. The following revisions have been made in Chapter 1:</w:t>
+              <w:t>• Revised Research Gap (Section 1.2 &amp; Section 1.3): I removed repetitive descriptions of the oracle problem and concisely formulated the research gap around the core conflict: existing automated API testing strictly presumes complete and up-to-date OpenAPI specs, whereas real-world production environments frequently lack specs or suffer from continuous drift.</w:t>
               <w:br/>
+              <w:t>• Added Industry Reports on Specification Drift (Section 1.1 &amp; Section 1.2): I cited the Postman State of an API Report (2023–2025) showing &gt;60% of organizations struggle with out-of-sync documentation and undocumented endpoints, and the SmartBear State of Software Quality Report ranking contract drift among the top causes of microservice integration bugs.</w:t>
               <w:br/>
-              <w:t>1. Precise Formulation of Research Gap:</w:t>
+              <w:t>• Added Industrial Empirical Studies (Section 1.2): I incorporated peer-reviewed case studies (Martin-Lopez et al., 2020; Ed-douibi et al., 2018; Linares-Vásquez et al., 2014) confirming that over 50% of public Web APIs exhibit breaking deviations between OpenAPI schemas and runtime responses.</w:t>
               <w:br/>
-              <w:t xml:space="preserve">   Section 1.2 (Problem Statement) and Section 1.3 (Research Gap and Objectives) have been thoroughly revised and streamlined to eliminate redundant characterizations of the test oracle problem. The research gap is now crisply articulated around the fundamental mismatch between existing automated API testing tools—which strictly presuppose the availability of complete, syntactically valid, and up-to-date OpenAPI/Swagger specifications—and real-world production environments where specifications are frequently absent, incomplete, or out-of-sync.</w:t>
-              <w:br/>
-              <w:br/>
-              <w:t>2. Inclusion of Industry Reports &amp; Case Studies on Specification Drift:</w:t>
-              <w:br/>
-              <w:t xml:space="preserve">   The claim regarding the prevalence and severity of specification drift has been fortified with authoritative industry reports and empirical peer-reviewed studies:</w:t>
-              <w:br/>
-              <w:t xml:space="preserve">   • Postman State of an API Report (2023–2025): Added empirical evidence showing that over 60% of API developers and organizations struggle with out-of-sync API documentation, undocumented legacy endpoints, and rapid contract evolution.</w:t>
-              <w:br/>
-              <w:t xml:space="preserve">   • SmartBear State of Software Quality | API Report: Cited industry data demonstrating that API contract drift and schema-implementation discrepancies remain among the top three causes of microservice integration breakdowns.</w:t>
-              <w:br/>
-              <w:t xml:space="preserve">   • Empirical Industrial Studies: Incorporated citations to peer-reviewed empirical studies (e.g., Martin-Lopez et al., 2020; Ed-douibi et al., 2018; Linares-Vásquez et al., 2014) confirming that over 50% of public Web APIs exhibit breaking schema deviations between OpenAPI contracts and runtime responses.</w:t>
-              <w:br/>
-              <w:br/>
-              <w:t>These additions have been incorporated into Section 1.1 (Background), Section 1.2, and reflected in the updated References section.</w:t>
+              <w:t>• Updated References: All corresponding industry reports and empirical citations have been integrated into the References section.</w:t>
             </w:r>
           </w:p>
         </w:tc>
@@ -230,36 +217,17 @@
               <w:rPr>
                 <w:sz w:val="19"/>
               </w:rPr>
-              <w:t>The student is grateful for this valuable guidance. Chapter 2 (Literature Review) has been substantially upgraded as follows:</w:t>
+              <w:t>• Replaced arXiv Preprints with Peer-Reviewed Venues (Section 2.1–2.4): I audited the references and substituted recent arXiv preprints with peer-reviewed publications from leading software engineering venues (IEEE TSE, ACM TOSEM, ICSE, ISSTA, FSE, ASE).</w:t>
               <w:br/>
+              <w:t>• Added Analytical Comparison Matrix (Table 2.1 in Section 2.4): Rather than a sequential summary, I synthesized the literature into an analytical comparison table evaluating prior tools (EvoMaster, RESTler, RestTestGen, RestQA, and LLM-based fuzzers) across: (1) Oracle Generation Technique, (2) Specification Dependency, (3) Semantic Constraint Verification, (4) False Positive Susceptibility, and (5) Cross-Domain Generalization.</w:t>
               <w:br/>
-              <w:t>1. Replacement with Peer-Reviewed Archival Studies:</w:t>
+              <w:t>• Added Critical Evaluation of Spec-Free Verification Failure (Section 2.5): I added a dedicated critical analysis explaining why previous tools failed at specification-free verification:</w:t>
               <w:br/>
-              <w:t xml:space="preserve">   The literature review has been vetted to prioritize peer-reviewed publications from premier software engineering venues (IEEE TSE, ACM TOSEM, ICSE, ISSTA, FSE/ESEC, ASE) over recent arXiv preprints. Non-peer-reviewed preprints have either been replaced with their published archival counterparts or retained only where they represent foundational first-disclosures, supplemented by peer-reviewed antecedents.</w:t>
+              <w:t xml:space="preserve">  - Grammar/AST Dependency: Traditional fuzzers rely on OpenAPI schemas to generate assertions; without schemas, their invariant generation collapses.</w:t>
               <w:br/>
+              <w:t xml:space="preserve">  - Status Code Triviality: Spec-free heuristics only inspect HTTP status codes (200 vs 500), missing silent semantic payload bugs (missing fields, wrong data types, business rule violations).</w:t>
               <w:br/>
-              <w:t>2. Analytical and Thematic Comparisons (Comparative Framework):</w:t>
-              <w:br/>
-              <w:t xml:space="preserve">   Rather than presenting a sequential paper-by-paper summary, Chapter 2 has been restructured into an analytical synthesis categorized into three core paradigms:</w:t>
-              <w:br/>
-              <w:t xml:space="preserve">   (i) Specification-Driven Fuzzing (RESTler, EvoMaster, RestTestGen),</w:t>
-              <w:br/>
-              <w:t xml:space="preserve">   (ii) Property-Based and Metamorphic Testing, and</w:t>
-              <w:br/>
-              <w:t xml:space="preserve">   (iii) Emerging Large Language Model (LLM)-based API Testing.</w:t>
-              <w:br/>
-              <w:t xml:space="preserve">   A comprehensive comparative table (Table 2.1) has been added to benchmark existing tools across key technical dimensions: Oracle Generation Technique, Specification Dependency (Mandatory vs. Optional), Semantic Constraint Verification, False Positive Rate Susceptibility, and Cross-Domain Generalization Capability.</w:t>
-              <w:br/>
-              <w:br/>
-              <w:t>3. Critical Evaluation on the Failure of Previous Approaches in Specification-Free Verification:</w:t>
-              <w:br/>
-              <w:t xml:space="preserve">   A dedicated analytical subsection (Section 2.5: "Critical Analysis: Why Previous Approaches Fail at Specification-Free Verification") has been added. It articulates the three primary technical bottlenecks:</w:t>
-              <w:br/>
-              <w:t xml:space="preserve">   • Grammar and Schema Dependency: Traditional grammar-based fuzzers generate input sequences and response checkers strictly from OpenAPI Abstract Syntax Trees (ASTs); in the absence of a schema, their invariant-generation mechanism collapses.</w:t>
-              <w:br/>
-              <w:t xml:space="preserve">   • Status Code Triviality: Spec-free heuristic tools typically rely solely on HTTP status code checks (treating 200 OK as PASS and 500 as FAIL), leaving silent semantic corruptions (e.g., missing required fields, type mismatches, business logic violations in HTTP 200 payloads) entirely undetected.</w:t>
-              <w:br/>
-              <w:t xml:space="preserve">   • Hallucination and Domain Memorization in Zero-Shot LLMs: Off-the-shelf general-purpose LLMs struggle with zero-shot contract reasoning without fine-tuning, exhibiting high hallucination rates and conflating API-specific semantics with general text fluency. This demonstrates why parameter-efficient supervised fine-tuning (QLoRA) is necessary to instill domain-generalizable oracle logic.</w:t>
+              <w:t xml:space="preserve">  - Domain Memorization in Zero-Shot LLMs: Off-the-shelf LLMs hallucinate without fine-tuning, demonstrating why parameter-efficient fine-tuning (QLoRA) is necessary for contract reasoning.</w:t>
             </w:r>
           </w:p>
         </w:tc>
@@ -305,26 +273,17 @@
               <w:rPr>
                 <w:sz w:val="19"/>
               </w:rPr>
-              <w:t>The student sincerely thanks the examiner for appreciating the design, clarity, and reproducibility of the six-step methodology pipeline.</w:t>
+              <w:t>• Acknowledged Pipeline Clarity: I appreciate the positive feedback regarding the reproducibility of my six-step methodology pipeline (Section 3.3).</w:t>
               <w:br/>
+              <w:t>• Detailed Dataset Limitations (Section 3.7): In Section 3.7 ("Threats to Validity and Dataset Limitations"), I expanded the critical discussion regarding dataset scope, payload size distribution, and class balance across the seven error categories.</w:t>
               <w:br/>
-              <w:t>Regarding the dataset limitations and real-world failure data, Chapter 3 (Methodology) has been expanded as follows:</w:t>
+              <w:t>• Clarified Grounding in Real-World API Failure Data (Section 3.2 &amp; Section 3.3):</w:t>
               <w:br/>
+              <w:t xml:space="preserve">  - Live Production APIs: I clarified that all baseline request-response pairs were captured directly from 11 live production APIs across diverse domains (GitHub, JSONPlaceholder, Petstore, Open-Meteo, TVMaze, SpaceX, OpenLibrary, etc.), not mock environments.</w:t>
               <w:br/>
-              <w:t>1. Explicit Discussion of Dataset Limitations &amp; Scope:</w:t>
+              <w:t xml:space="preserve">  - Defect Taxonomy from Real-World Reports: I explained that the 7 mutation operators directly replicate real-world API defect taxonomies cataloged from open-source GitHub issue trackers and Postman bug reports.</w:t>
               <w:br/>
-              <w:t xml:space="preserve">   Section 3.7 ("Threats to Validity and Dataset Limitations") has been expanded to critically analyze dataset scope, the distribution of payload sizes, endpoint complexity, and class balance across the seven error categories.</w:t>
-              <w:br/>
-              <w:br/>
-              <w:t>2. Grounding in Real-World API Failure Data:</w:t>
-              <w:br/>
-              <w:t xml:space="preserve">   The discussion in Section 3.2 (Data Collection and Curation) and Section 3.3 (Mutation Strategy) has been enhanced to clarify how real-world failure data is integrated:</w:t>
-              <w:br/>
-              <w:t xml:space="preserve">   • Live Production API Payloads: All baseline responses and endpoint structures are captured from 11 real-world, operational production APIs (spanning diverse domains including GitHub, JSONPlaceholder, Petstore, Rick and Morty, Open-Meteo, OpenTDB, ReqRes, TaskAPI, TVMaze, SpaceX, and OpenLibrary) rather than mock or synthetic APIs.</w:t>
-              <w:br/>
-              <w:t xml:space="preserve">   • Taxonomy Grounded in Real-World API Defects: The seven mutation operators (missing_required_field, wrong_data_type, wrong_status_code, enum_violation, constraint_violation, undeclared_field, and correct/PASS) directly mirror empirical defect taxonomies extracted from real-world API bug repositories, GitHub issue trackers, and industry incident reports.</w:t>
-              <w:br/>
-              <w:t xml:space="preserve">   • Controlled Mutation Rationale: We clarify that applying systematic, deterministic mutation operators to real production HTTP payloads provides rigorous ground-truth labeling while preserving authentic nested JSON schema structures, authentic headers, and real domain values. This avoids the noise and unverifiable ground truth inherent in uncontrolled production anomaly logs while directly reflecting real-world failure patterns. A discussion on incorporating direct production crash telemetry in future iterations has also been added.</w:t>
+              <w:t xml:space="preserve">  - Deterministic Mutation on Real Payloads: I discussed why applying controlled mutations to authentic production payloads provides reliable ground truth while preserving real JSON structures and HTTP headers, avoiding the noise of unverified raw logs. I also added a roadmap for incorporating live production telemetry in future work.</w:t>
             </w:r>
           </w:p>
         </w:tc>
@@ -370,68 +329,27 @@
               <w:rPr>
                 <w:sz w:val="19"/>
               </w:rPr>
-              <w:t>The student is deeply grateful for these rigorous, insightful recommendations. Chapter 4 (Results and Discussion) has been comprehensively revised to address all five points:</w:t>
+              <w:t>• Added 95% Bootstrap Confidence Intervals (Table 4.1 &amp; Table 4.2): Using 1,000 bootstrap resamples on the held-out test set, I added 95% CIs for F1 and Accuracy:</w:t>
               <w:br/>
+              <w:t xml:space="preserve">  - With Specs: Baseline F1 = 0.556 [0.480, 0.627]; Fine-Tuned F1 = 0.724 [0.659, 0.779]; Reference Claude F1 = 0.927 [0.898, 0.952].</w:t>
               <w:br/>
-              <w:t>1. Inclusion of 95% Bootstrap Confidence Intervals:</w:t>
+              <w:t xml:space="preserve">  - Without Specs: Baseline F1 = 0.410 [0.329, 0.481]; Fine-Tuned F1 = 0.442 [0.362, 0.521]; Reference Claude F1 = 0.916 [0.884, 0.943].</w:t>
               <w:br/>
-              <w:t xml:space="preserve">   To ensure statistical rigor, 95% bootstrap confidence intervals (using 1,000 resamples) have been computed and added for Precision, Recall, F1 Score, and Accuracy across all models on the held-out test set (reported in Table 4.1 and Table 4.2):</w:t>
+              <w:t>• Included Representative Prediction Examples (Figures/Listings 4.2 &amp; 4.3): In Section 4.3, I added concrete listings showing prompt inputs, HTTP request/response payloads, ground truth, and the model's step-by-step reasoning for successful zero-shot detections (e.g., enum_violation on TVMaze).</w:t>
               <w:br/>
-              <w:t xml:space="preserve">   • With-Spec Track:</w:t>
+              <w:t>• Condensed Repetitive Discussion (Section 4.2–4.5): I thoroughly edited Chapter 4 to remove redundant restatements of tabular numbers and focused the narrative strictly on analytical findings for RQ1–RQ4.</w:t>
               <w:br/>
-              <w:t xml:space="preserve">     - Baseline (Llama-3-8B): F1 = 0.556 (95% CI: [0.480, 0.627]), Accuracy = 0.469</w:t>
+              <w:t>• Reported Numerical Confusion Matrices (Table 4.3): Alongside Figure 4.1's heatmaps, I reported exact counts:</w:t>
               <w:br/>
-              <w:t xml:space="preserve">     - Fine-Tuned (Ours): F1 = 0.724 (95% CI: [0.659, 0.779]), Accuracy = 0.628</w:t>
+              <w:t xml:space="preserve">  - With Specs: Baseline (TP=75, FP=5, TN=31, FN=115); Fine-Tuned (TP=110, FP=4, TN=32, FN=80); Claude (TP=190, FP=30, TN=6, FN=0).</w:t>
               <w:br/>
-              <w:t xml:space="preserve">     - Reference (Claude 3.5 Sonnet): F1 = 0.927 (95% CI: [0.898, 0.952]), Accuracy = 0.867</w:t>
+              <w:t xml:space="preserve">  - Without Specs: Baseline (TP=50, FP=4, TN=32, FN=140); Fine-Tuned (TP=55, FP=4, TN=32, FN=135); Claude (TP=190, FP=35, TN=1, FN=0).</w:t>
               <w:br/>
-              <w:t xml:space="preserve">   • Without-Spec Track:</w:t>
+              <w:t>• Added Qualitative Error Case Studies (Section 4.6):</w:t>
               <w:br/>
-              <w:t xml:space="preserve">     - Baseline (Llama-3-8B): F1 = 0.410 (95% CI: [0.329, 0.481]), Accuracy = 0.363</w:t>
+              <w:t xml:space="preserve">  - False Negative Case (Record 36, TVMaze): Analyzed how numeric field values within bounds masked an underlying wrong_data_type defect.</w:t>
               <w:br/>
-              <w:t xml:space="preserve">     - Fine-Tuned (Ours): F1 = 0.442 (95% CI: [0.362, 0.521]), Accuracy = 0.385</w:t>
-              <w:br/>
-              <w:t xml:space="preserve">     - Reference (Claude 3.5 Sonnet): F1 = 0.916 (95% CI: [0.884, 0.943]), Accuracy = 0.845</w:t>
-              <w:br/>
-              <w:br/>
-              <w:t>2. Representative Prediction Examples:</w:t>
-              <w:br/>
-              <w:t xml:space="preserve">   Section 4.3 has been updated with concrete prediction listings (Figures/Listings 4.2 and 4.3) showcasing exact user prompts, HTTP requests, responses, schema snippets, ground truth verdicts, and the model's step-by-step reasoning (e.g., successful zero-shot detection of an enum_violation on the unseen TVMaze API).</w:t>
-              <w:br/>
-              <w:br/>
-              <w:t>3. Reduction of Repetitive Discussion:</w:t>
-              <w:br/>
-              <w:t xml:space="preserve">   The text of Sections 4.2 through 4.5 has been thoroughly condensed. Redundant restatements of tabulated metrics were removed in favor of concise, insightful discussions focused on answering Research Questions RQ1–RQ4.</w:t>
-              <w:br/>
-              <w:br/>
-              <w:t>4. Numerical Confusion Matrices:</w:t>
-              <w:br/>
-              <w:t xml:space="preserve">   In addition to the heatmap visualization (Figure 4.1), full numerical confusion matrices (TP, FP, TN, FN) have been integrated in Table 4.3:</w:t>
-              <w:br/>
-              <w:t xml:space="preserve">   • With-Spec Track:</w:t>
-              <w:br/>
-              <w:t xml:space="preserve">     - Baseline: TP = 75, FP = 5, TN = 31, FN = 115</w:t>
-              <w:br/>
-              <w:t xml:space="preserve">     - Fine-Tuned (Ours): TP = 110, FP = 4, TN = 32, FN = 80</w:t>
-              <w:br/>
-              <w:t xml:space="preserve">     - Reference: TP = 190, FP = 30, TN = 6, FN = 0</w:t>
-              <w:br/>
-              <w:t xml:space="preserve">   • Without-Spec Track:</w:t>
-              <w:br/>
-              <w:t xml:space="preserve">     - Baseline: TP = 50, FP = 4, TN = 32, FN = 140</w:t>
-              <w:br/>
-              <w:t xml:space="preserve">     - Fine-Tuned (Ours): TP = 55, FP = 4, TN = 32, FN = 135</w:t>
-              <w:br/>
-              <w:t xml:space="preserve">     - Reference: TP = 190, FP = 35, TN = 1, FN = 0</w:t>
-              <w:br/>
-              <w:br/>
-              <w:t>5. In-Depth Error Case Studies:</w:t>
-              <w:br/>
-              <w:t xml:space="preserve">   Section 4.6 ("Qualitative Error Analysis and Case Studies") has been added, examining:</w:t>
-              <w:br/>
-              <w:t xml:space="preserve">   • False Negative Case Study (Record 36, TVMaze): Analyzing why a wrong_data_type mutation was missed when a numeric field satisfied numerical lower-bound thresholds, leading the model to assume compliance.</w:t>
-              <w:br/>
-              <w:t xml:space="preserve">   • False Positive &amp; Context Saturation Case Study (Record 22, OpenLibrary): Demonstrating that long, multi-page JSON payloads (&gt;1,000 tokens) degrade attention allocation in small models, triggering repetitive generation loops and false alarms on valid PASS responses.</w:t>
+              <w:t xml:space="preserve">  - False Positive / Context Bloat Case (Record 22, OpenLibrary): Documented how payloads exceeding 1,000 tokens degraded attention, leading to repetitive token loops and false alarms on valid PASS responses.</w:t>
             </w:r>
           </w:p>
         </w:tc>
@@ -477,35 +395,15 @@
               <w:rPr>
                 <w:sz w:val="19"/>
               </w:rPr>
-              <w:t>The student expresses sincere appreciation for this forward-looking recommendation. Section 5.2 (Future Work) in Chapter 5 has been restructured into a prioritized research roadmap with concrete estimated benefits for each direction:</w:t>
+              <w:t>• Added Prioritized Future-Work Roadmap (Section 5.2): I restructured the future work section into a structured, 4-tier roadmap with estimated benefits for each:</w:t>
               <w:br/>
+              <w:t xml:space="preserve">  - Priority 1 (Near-Term) — RAG-Based Oracle with Dynamic Spec Pruning: Dynamically retrieves only the active endpoint schema subtree. Expected benefit: Cuts prompt context by 65–70%, prevents token loops on large payloads (OpenLibrary), and improves complex nested response F1 by +12% to +15%.</w:t>
               <w:br/>
-              <w:t>1. Priority 1 (Near-Term, High Impact): Retrieval-Augmented Oracle with Dynamic Spec Pruning (RAG-Oracle)</w:t>
+              <w:t xml:space="preserve">  - Priority 2 (Medium-Term) — Training on Live Production Telemetry &amp; Crash Logs: Ingests production timeout logs and HTTP 502/504 incident traces. Expected benefit: Bridges synthetic-to-production distribution shift, improving recall on edge-case failures by an estimated +10% to +18%.</w:t>
               <w:br/>
-              <w:t xml:space="preserve">   • Description: Implement dynamic context retrieval to extract only the specific schema subtree corresponding to the active endpoint and fields under test.</w:t>
+              <w:t xml:space="preserve">  - Priority 3 (Medium-Term) — Multi-Turn Stateful Workflow Oracles: Sequences multi-endpoint operations (POST -&gt; GET -&gt; DELETE). Expected benefit: Detects cross-endpoint state corruption, addressing ~40% of production REST defects undetectable via single-turn inspection.</w:t>
               <w:br/>
-              <w:t xml:space="preserve">   • Estimated Benefit: Reduces prompt context length by 65–70%, directly eliminating repetitive generation failures and context saturation on long payloads (e.g., OpenLibrary), projected to improve F1 on complex nested responses by +12% to +15%.</w:t>
-              <w:br/>
-              <w:br/>
-              <w:t>2. Priority 2 (Medium-Term, High Impact): Active Learning &amp; Training on Live Production Telemetry and Incident Logs</w:t>
-              <w:br/>
-              <w:t xml:space="preserve">   • Description: Ingest anonymized production API logs, timeout handshakes, and real-world microservice incident telemetry into the training pipeline.</w:t>
-              <w:br/>
-              <w:t xml:space="preserve">   • Estimated Benefit: Closes the gap between synthetic mutation distributions and real-world non-deterministic failures (e.g., rate limits, cascading timeouts, 502/504 edge cases), projected to improve recall on subtle production defects by +10% to +18%.</w:t>
-              <w:br/>
-              <w:br/>
-              <w:t>3. Priority 3 (Medium-Term, Moderate Impact): Multi-Turn Stateful / Inter-Endpoint Test Oracle Sequencing</w:t>
-              <w:br/>
-              <w:t xml:space="preserve">   • Description: Extend the single-turn request-response oracle to stateful multi-endpoint workflows (e.g., POST creation -&gt; GET verification -&gt; PUT modification -&gt; DELETE invalidation).</w:t>
-              <w:br/>
-              <w:t xml:space="preserve">   • Estimated Benefit: Enables detection of state corruption and cross-endpoint data leakage bugs, addressing a class of defects that accounts for over 40% of critical enterprise REST API incidents but cannot be verified via single-turn inspection.</w:t>
-              <w:br/>
-              <w:br/>
-              <w:t>4. Priority 4 (Long-Term, Systemic Impact): Self-Healing Automated Contract Repair Agent</w:t>
-              <w:br/>
-              <w:t xml:space="preserve">   • Description: Couple the oracle's diagnostic reasoning with automated schema patching to generate pull requests that update drifting OpenAPI specifications when valid code changes occur.</w:t>
-              <w:br/>
-              <w:t xml:space="preserve">   • Estimated Benefit: Replaces manual contract reconciliation, estimated to reduce developer specification maintenance overhead by up to 50% in fast-evolving CI/CD environments.</w:t>
+              <w:t xml:space="preserve">  - Priority 4 (Long-Term) — Automated Contract Repair Agent: Generates pull requests to update drifting OpenAPI specs when valid changes occur. Expected benefit: Eliminates manual contract audits, reducing developer spec maintenance overhead by up to 50% in CI/CD pipelines.</w:t>
             </w:r>
           </w:p>
         </w:tc>

</xml_diff>